<commit_message>
Changed the docs. Pre-final 1.
</commit_message>
<xml_diff>
--- a/docs/(REMAKE)_Paket_2_SPK_RPL_Pengembangan_App_Parkir.docx
+++ b/docs/(REMAKE)_Paket_2_SPK_RPL_Pengembangan_App_Parkir.docx
@@ -25,12 +25,6 @@
         <w:gridCol w:w="2300"/>
       </w:tblGrid>
       <w:tr>
-        <w:tblPrEx>
-          <w:tblCellMar>
-            <w:top w:w="0" w:type="dxa"/>
-            <w:bottom w:w="0" w:type="dxa"/>
-          </w:tblCellMar>
-        </w:tblPrEx>
         <w:tc>
           <w:tcPr>
             <w:tcW w:w="2300" w:type="dxa"/>
@@ -197,12 +191,6 @@
         <w:gridCol w:w="5000"/>
       </w:tblGrid>
       <w:tr>
-        <w:tblPrEx>
-          <w:tblCellMar>
-            <w:top w:w="0" w:type="dxa"/>
-            <w:bottom w:w="0" w:type="dxa"/>
-          </w:tblCellMar>
-        </w:tblPrEx>
         <w:tc>
           <w:tcPr>
             <w:tcW w:w="2800" w:type="dxa"/>
@@ -251,12 +239,6 @@
         </w:tc>
       </w:tr>
       <w:tr>
-        <w:tblPrEx>
-          <w:tblCellMar>
-            <w:top w:w="0" w:type="dxa"/>
-            <w:bottom w:w="0" w:type="dxa"/>
-          </w:tblCellMar>
-        </w:tblPrEx>
         <w:tc>
           <w:tcPr>
             <w:tcW w:w="2800" w:type="dxa"/>
@@ -305,12 +287,6 @@
         </w:tc>
       </w:tr>
       <w:tr>
-        <w:tblPrEx>
-          <w:tblCellMar>
-            <w:top w:w="0" w:type="dxa"/>
-            <w:bottom w:w="0" w:type="dxa"/>
-          </w:tblCellMar>
-        </w:tblPrEx>
         <w:tc>
           <w:tcPr>
             <w:tcW w:w="2800" w:type="dxa"/>
@@ -359,12 +335,6 @@
         </w:tc>
       </w:tr>
       <w:tr>
-        <w:tblPrEx>
-          <w:tblCellMar>
-            <w:top w:w="0" w:type="dxa"/>
-            <w:bottom w:w="0" w:type="dxa"/>
-          </w:tblCellMar>
-        </w:tblPrEx>
         <w:tc>
           <w:tcPr>
             <w:tcW w:w="2800" w:type="dxa"/>
@@ -413,12 +383,6 @@
         </w:tc>
       </w:tr>
       <w:tr>
-        <w:tblPrEx>
-          <w:tblCellMar>
-            <w:top w:w="0" w:type="dxa"/>
-            <w:bottom w:w="0" w:type="dxa"/>
-          </w:tblCellMar>
-        </w:tblPrEx>
         <w:tc>
           <w:tcPr>
             <w:tcW w:w="2800" w:type="dxa"/>
@@ -467,12 +431,6 @@
         </w:tc>
       </w:tr>
       <w:tr>
-        <w:tblPrEx>
-          <w:tblCellMar>
-            <w:top w:w="0" w:type="dxa"/>
-            <w:bottom w:w="0" w:type="dxa"/>
-          </w:tblCellMar>
-        </w:tblPrEx>
         <w:tc>
           <w:tcPr>
             <w:tcW w:w="2800" w:type="dxa"/>
@@ -602,8 +560,33 @@
           <w:i/>
           <w:iCs/>
         </w:rPr>
-        <w:t>Standard Operating Procedure</w:t>
-      </w:r>
+        <w:t xml:space="preserve">Standard </w:t>
+      </w:r>
+      <w:proofErr w:type="spellStart"/>
+      <w:r>
+        <w:rPr>
+          <w:i/>
+          <w:iCs/>
+        </w:rPr>
+        <w:t>Operating</w:t>
+      </w:r>
+      <w:proofErr w:type="spellEnd"/>
+      <w:r>
+        <w:rPr>
+          <w:i/>
+          <w:iCs/>
+        </w:rPr>
+        <w:t xml:space="preserve"> </w:t>
+      </w:r>
+      <w:proofErr w:type="spellStart"/>
+      <w:r>
+        <w:rPr>
+          <w:i/>
+          <w:iCs/>
+        </w:rPr>
+        <w:t>Procedure</w:t>
+      </w:r>
+      <w:proofErr w:type="spellEnd"/>
       <w:r>
         <w:t>)</w:t>
       </w:r>
@@ -671,12 +654,6 @@
         <w:gridCol w:w="1870"/>
       </w:tblGrid>
       <w:tr>
-        <w:tblPrEx>
-          <w:tblCellMar>
-            <w:top w:w="0" w:type="dxa"/>
-            <w:bottom w:w="0" w:type="dxa"/>
-          </w:tblCellMar>
-        </w:tblPrEx>
         <w:trPr>
           <w:cantSplit/>
         </w:trPr>
@@ -856,12 +833,6 @@
         </w:tc>
       </w:tr>
       <w:tr>
-        <w:tblPrEx>
-          <w:tblCellMar>
-            <w:top w:w="0" w:type="dxa"/>
-            <w:bottom w:w="0" w:type="dxa"/>
-          </w:tblCellMar>
-        </w:tblPrEx>
         <w:trPr>
           <w:cantSplit/>
         </w:trPr>
@@ -1027,12 +998,6 @@
         </w:tc>
       </w:tr>
       <w:tr>
-        <w:tblPrEx>
-          <w:tblCellMar>
-            <w:top w:w="0" w:type="dxa"/>
-            <w:bottom w:w="0" w:type="dxa"/>
-          </w:tblCellMar>
-        </w:tblPrEx>
         <w:trPr>
           <w:cantSplit/>
         </w:trPr>
@@ -1143,12 +1108,6 @@
         </w:tc>
       </w:tr>
       <w:tr>
-        <w:tblPrEx>
-          <w:tblCellMar>
-            <w:top w:w="0" w:type="dxa"/>
-            <w:bottom w:w="0" w:type="dxa"/>
-          </w:tblCellMar>
-        </w:tblPrEx>
         <w:trPr>
           <w:cantSplit/>
         </w:trPr>
@@ -1207,7 +1166,23 @@
                 <w:sz w:val="22"/>
                 <w:szCs w:val="22"/>
               </w:rPr>
-              <w:t>PC Client/Laptop</w:t>
+              <w:t xml:space="preserve">PC </w:t>
+            </w:r>
+            <w:proofErr w:type="spellStart"/>
+            <w:r>
+              <w:rPr>
+                <w:sz w:val="22"/>
+                <w:szCs w:val="22"/>
+              </w:rPr>
+              <w:t>Client</w:t>
+            </w:r>
+            <w:proofErr w:type="spellEnd"/>
+            <w:r>
+              <w:rPr>
+                <w:sz w:val="22"/>
+                <w:szCs w:val="22"/>
+              </w:rPr>
+              <w:t>/Laptop</w:t>
             </w:r>
           </w:p>
         </w:tc>
@@ -1229,6 +1204,7 @@
             <w:vAlign w:val="center"/>
           </w:tcPr>
           <w:p>
+            <w:proofErr w:type="spellStart"/>
             <w:r>
               <w:rPr>
                 <w:i/>
@@ -1238,6 +1214,7 @@
               </w:rPr>
               <w:t>Processor</w:t>
             </w:r>
+            <w:proofErr w:type="spellEnd"/>
             <w:r>
               <w:rPr>
                 <w:sz w:val="22"/>
@@ -1297,12 +1274,6 @@
         </w:tc>
       </w:tr>
       <w:tr>
-        <w:tblPrEx>
-          <w:tblCellMar>
-            <w:top w:w="0" w:type="dxa"/>
-            <w:bottom w:w="0" w:type="dxa"/>
-          </w:tblCellMar>
-        </w:tblPrEx>
         <w:trPr>
           <w:cantSplit/>
         </w:trPr>
@@ -1357,6 +1328,7 @@
               </w:rPr>
               <w:t xml:space="preserve">RAM: 4 GB </w:t>
             </w:r>
+            <w:proofErr w:type="spellStart"/>
             <w:r>
               <w:rPr>
                 <w:i/>
@@ -1366,6 +1338,7 @@
               </w:rPr>
               <w:t>Harddisk</w:t>
             </w:r>
+            <w:proofErr w:type="spellEnd"/>
           </w:p>
         </w:tc>
         <w:tc>
@@ -1396,12 +1369,6 @@
         </w:tc>
       </w:tr>
       <w:tr>
-        <w:tblPrEx>
-          <w:tblCellMar>
-            <w:top w:w="0" w:type="dxa"/>
-            <w:bottom w:w="0" w:type="dxa"/>
-          </w:tblCellMar>
-        </w:tblPrEx>
         <w:trPr>
           <w:cantSplit/>
         </w:trPr>
@@ -1486,12 +1453,6 @@
         </w:tc>
       </w:tr>
       <w:tr>
-        <w:tblPrEx>
-          <w:tblCellMar>
-            <w:top w:w="0" w:type="dxa"/>
-            <w:bottom w:w="0" w:type="dxa"/>
-          </w:tblCellMar>
-        </w:tblPrEx>
         <w:trPr>
           <w:cantSplit/>
         </w:trPr>
@@ -1585,12 +1546,6 @@
         </w:tc>
       </w:tr>
       <w:tr>
-        <w:tblPrEx>
-          <w:tblCellMar>
-            <w:top w:w="0" w:type="dxa"/>
-            <w:bottom w:w="0" w:type="dxa"/>
-          </w:tblCellMar>
-        </w:tblPrEx>
         <w:trPr>
           <w:cantSplit/>
         </w:trPr>
@@ -1677,12 +1632,6 @@
         </w:tc>
       </w:tr>
       <w:tr>
-        <w:tblPrEx>
-          <w:tblCellMar>
-            <w:top w:w="0" w:type="dxa"/>
-            <w:bottom w:w="0" w:type="dxa"/>
-          </w:tblCellMar>
-        </w:tblPrEx>
         <w:trPr>
           <w:cantSplit/>
         </w:trPr>
@@ -1730,6 +1679,7 @@
             <w:vAlign w:val="center"/>
           </w:tcPr>
           <w:p>
+            <w:proofErr w:type="spellStart"/>
             <w:r>
               <w:rPr>
                 <w:i/>
@@ -1739,6 +1689,7 @@
               </w:rPr>
               <w:t>Keyboard</w:t>
             </w:r>
+            <w:proofErr w:type="spellEnd"/>
           </w:p>
         </w:tc>
         <w:tc>
@@ -1769,12 +1720,6 @@
         </w:tc>
       </w:tr>
       <w:tr>
-        <w:tblPrEx>
-          <w:tblCellMar>
-            <w:top w:w="0" w:type="dxa"/>
-            <w:bottom w:w="0" w:type="dxa"/>
-          </w:tblCellMar>
-        </w:tblPrEx>
         <w:trPr>
           <w:cantSplit/>
         </w:trPr>
@@ -1885,8 +1830,17 @@
                 <w:sz w:val="22"/>
                 <w:szCs w:val="22"/>
               </w:rPr>
-              <w:t>1 line</w:t>
-            </w:r>
+              <w:t xml:space="preserve">1 </w:t>
+            </w:r>
+            <w:proofErr w:type="spellStart"/>
+            <w:r>
+              <w:rPr>
+                <w:sz w:val="22"/>
+                <w:szCs w:val="22"/>
+              </w:rPr>
+              <w:t>line</w:t>
+            </w:r>
+            <w:proofErr w:type="spellEnd"/>
           </w:p>
         </w:tc>
         <w:tc>
@@ -1910,12 +1864,6 @@
         </w:tc>
       </w:tr>
       <w:tr>
-        <w:tblPrEx>
-          <w:tblCellMar>
-            <w:top w:w="0" w:type="dxa"/>
-            <w:bottom w:w="0" w:type="dxa"/>
-          </w:tblCellMar>
-        </w:tblPrEx>
         <w:trPr>
           <w:cantSplit/>
         </w:trPr>
@@ -2026,12 +1974,6 @@
         </w:tc>
       </w:tr>
       <w:tr>
-        <w:tblPrEx>
-          <w:tblCellMar>
-            <w:top w:w="0" w:type="dxa"/>
-            <w:bottom w:w="0" w:type="dxa"/>
-          </w:tblCellMar>
-        </w:tblPrEx>
         <w:trPr>
           <w:cantSplit/>
         </w:trPr>
@@ -2167,12 +2109,6 @@
         </w:tc>
       </w:tr>
       <w:tr>
-        <w:tblPrEx>
-          <w:tblCellMar>
-            <w:top w:w="0" w:type="dxa"/>
-            <w:bottom w:w="0" w:type="dxa"/>
-          </w:tblCellMar>
-        </w:tblPrEx>
         <w:trPr>
           <w:cantSplit/>
         </w:trPr>
@@ -2224,6 +2160,7 @@
             <w:vAlign w:val="center"/>
           </w:tcPr>
           <w:p>
+            <w:proofErr w:type="spellStart"/>
             <w:r>
               <w:rPr>
                 <w:i/>
@@ -2231,14 +2168,40 @@
                 <w:sz w:val="22"/>
                 <w:szCs w:val="22"/>
               </w:rPr>
-              <w:t>Text Editor</w:t>
-            </w:r>
-            <w:r>
-              <w:rPr>
-                <w:sz w:val="22"/>
-                <w:szCs w:val="22"/>
-              </w:rPr>
-              <w:t xml:space="preserve"> / Tools Pemrograman</w:t>
+              <w:t>Text</w:t>
+            </w:r>
+            <w:proofErr w:type="spellEnd"/>
+            <w:r>
+              <w:rPr>
+                <w:i/>
+                <w:iCs/>
+                <w:sz w:val="22"/>
+                <w:szCs w:val="22"/>
+              </w:rPr>
+              <w:t xml:space="preserve"> Editor</w:t>
+            </w:r>
+            <w:r>
+              <w:rPr>
+                <w:sz w:val="22"/>
+                <w:szCs w:val="22"/>
+              </w:rPr>
+              <w:t xml:space="preserve"> / </w:t>
+            </w:r>
+            <w:proofErr w:type="spellStart"/>
+            <w:r>
+              <w:rPr>
+                <w:sz w:val="22"/>
+                <w:szCs w:val="22"/>
+              </w:rPr>
+              <w:t>Tools</w:t>
+            </w:r>
+            <w:proofErr w:type="spellEnd"/>
+            <w:r>
+              <w:rPr>
+                <w:sz w:val="22"/>
+                <w:szCs w:val="22"/>
+              </w:rPr>
+              <w:t xml:space="preserve"> Pemrograman</w:t>
             </w:r>
           </w:p>
         </w:tc>
@@ -2325,12 +2288,6 @@
         </w:tc>
       </w:tr>
       <w:tr>
-        <w:tblPrEx>
-          <w:tblCellMar>
-            <w:top w:w="0" w:type="dxa"/>
-            <w:bottom w:w="0" w:type="dxa"/>
-          </w:tblCellMar>
-        </w:tblPrEx>
         <w:trPr>
           <w:cantSplit/>
         </w:trPr>
@@ -2463,23 +2420,26 @@
             <w:vAlign w:val="center"/>
           </w:tcPr>
           <w:p>
-            <w:r>
-              <w:rPr>
-                <w:sz w:val="22"/>
-                <w:szCs w:val="22"/>
-              </w:rPr>
-              <w:t>MySQL (XAMPP)</w:t>
+            <w:proofErr w:type="spellStart"/>
+            <w:r>
+              <w:rPr>
+                <w:sz w:val="22"/>
+                <w:szCs w:val="22"/>
+              </w:rPr>
+              <w:t>MySQL</w:t>
+            </w:r>
+            <w:proofErr w:type="spellEnd"/>
+            <w:r>
+              <w:rPr>
+                <w:sz w:val="22"/>
+                <w:szCs w:val="22"/>
+              </w:rPr>
+              <w:t xml:space="preserve"> (XAMPP)</w:t>
             </w:r>
           </w:p>
         </w:tc>
       </w:tr>
       <w:tr>
-        <w:tblPrEx>
-          <w:tblCellMar>
-            <w:top w:w="0" w:type="dxa"/>
-            <w:bottom w:w="0" w:type="dxa"/>
-          </w:tblCellMar>
-        </w:tblPrEx>
         <w:trPr>
           <w:cantSplit/>
         </w:trPr>
@@ -2531,6 +2491,7 @@
             <w:vAlign w:val="center"/>
           </w:tcPr>
           <w:p>
+            <w:proofErr w:type="spellStart"/>
             <w:r>
               <w:rPr>
                 <w:i/>
@@ -2538,8 +2499,29 @@
                 <w:sz w:val="22"/>
                 <w:szCs w:val="22"/>
               </w:rPr>
-              <w:t>Debugging Tools</w:t>
-            </w:r>
+              <w:t>Debugging</w:t>
+            </w:r>
+            <w:proofErr w:type="spellEnd"/>
+            <w:r>
+              <w:rPr>
+                <w:i/>
+                <w:iCs/>
+                <w:sz w:val="22"/>
+                <w:szCs w:val="22"/>
+              </w:rPr>
+              <w:t xml:space="preserve"> </w:t>
+            </w:r>
+            <w:proofErr w:type="spellStart"/>
+            <w:r>
+              <w:rPr>
+                <w:i/>
+                <w:iCs/>
+                <w:sz w:val="22"/>
+                <w:szCs w:val="22"/>
+              </w:rPr>
+              <w:t>Tools</w:t>
+            </w:r>
+            <w:proofErr w:type="spellEnd"/>
           </w:p>
         </w:tc>
         <w:tc>
@@ -2619,18 +2601,28 @@
                 <w:sz w:val="22"/>
                 <w:szCs w:val="22"/>
               </w:rPr>
-              <w:t>Developer Tools peramban</w:t>
+              <w:t xml:space="preserve">Developer </w:t>
+            </w:r>
+            <w:proofErr w:type="spellStart"/>
+            <w:r>
+              <w:rPr>
+                <w:sz w:val="22"/>
+                <w:szCs w:val="22"/>
+              </w:rPr>
+              <w:t>Tools</w:t>
+            </w:r>
+            <w:proofErr w:type="spellEnd"/>
+            <w:r>
+              <w:rPr>
+                <w:sz w:val="22"/>
+                <w:szCs w:val="22"/>
+              </w:rPr>
+              <w:t xml:space="preserve"> peramban</w:t>
             </w:r>
           </w:p>
         </w:tc>
       </w:tr>
       <w:tr>
-        <w:tblPrEx>
-          <w:tblCellMar>
-            <w:top w:w="0" w:type="dxa"/>
-            <w:bottom w:w="0" w:type="dxa"/>
-          </w:tblCellMar>
-        </w:tblPrEx>
         <w:trPr>
           <w:cantSplit/>
         </w:trPr>
@@ -2774,12 +2766,6 @@
         </w:tc>
       </w:tr>
       <w:tr>
-        <w:tblPrEx>
-          <w:tblCellMar>
-            <w:top w:w="0" w:type="dxa"/>
-            <w:bottom w:w="0" w:type="dxa"/>
-          </w:tblCellMar>
-        </w:tblPrEx>
         <w:trPr>
           <w:cantSplit/>
         </w:trPr>
@@ -2917,18 +2903,28 @@
                 <w:sz w:val="22"/>
                 <w:szCs w:val="22"/>
               </w:rPr>
-              <w:t>XAMPP (Apache, PHP)</w:t>
+              <w:t>XAMPP (</w:t>
+            </w:r>
+            <w:proofErr w:type="spellStart"/>
+            <w:r>
+              <w:rPr>
+                <w:sz w:val="22"/>
+                <w:szCs w:val="22"/>
+              </w:rPr>
+              <w:t>Apache</w:t>
+            </w:r>
+            <w:proofErr w:type="spellEnd"/>
+            <w:r>
+              <w:rPr>
+                <w:sz w:val="22"/>
+                <w:szCs w:val="22"/>
+              </w:rPr>
+              <w:t>, PHP)</w:t>
             </w:r>
           </w:p>
         </w:tc>
       </w:tr>
       <w:tr>
-        <w:tblPrEx>
-          <w:tblCellMar>
-            <w:top w:w="0" w:type="dxa"/>
-            <w:bottom w:w="0" w:type="dxa"/>
-          </w:tblCellMar>
-        </w:tblPrEx>
         <w:trPr>
           <w:cantSplit/>
         </w:trPr>
@@ -3067,18 +3063,21 @@
                 <w:sz w:val="22"/>
                 <w:szCs w:val="22"/>
               </w:rPr>
-              <w:t>Google Chrome</w:t>
-            </w:r>
+              <w:t xml:space="preserve">Google </w:t>
+            </w:r>
+            <w:proofErr w:type="spellStart"/>
+            <w:r>
+              <w:rPr>
+                <w:sz w:val="22"/>
+                <w:szCs w:val="22"/>
+              </w:rPr>
+              <w:t>Chrome</w:t>
+            </w:r>
+            <w:proofErr w:type="spellEnd"/>
           </w:p>
         </w:tc>
       </w:tr>
       <w:tr>
-        <w:tblPrEx>
-          <w:tblCellMar>
-            <w:top w:w="0" w:type="dxa"/>
-            <w:bottom w:w="0" w:type="dxa"/>
-          </w:tblCellMar>
-        </w:tblPrEx>
         <w:trPr>
           <w:cantSplit/>
         </w:trPr>
@@ -3130,12 +3129,21 @@
             <w:vAlign w:val="center"/>
           </w:tcPr>
           <w:p>
-            <w:r>
-              <w:rPr>
-                <w:sz w:val="22"/>
-                <w:szCs w:val="22"/>
-              </w:rPr>
-              <w:t>Tools Pembuat Diagram</w:t>
+            <w:proofErr w:type="spellStart"/>
+            <w:r>
+              <w:rPr>
+                <w:sz w:val="22"/>
+                <w:szCs w:val="22"/>
+              </w:rPr>
+              <w:t>Tools</w:t>
+            </w:r>
+            <w:proofErr w:type="spellEnd"/>
+            <w:r>
+              <w:rPr>
+                <w:sz w:val="22"/>
+                <w:szCs w:val="22"/>
+              </w:rPr>
+              <w:t xml:space="preserve"> Pembuat Diagram</w:t>
             </w:r>
           </w:p>
         </w:tc>
@@ -3211,12 +3219,37 @@
             <w:vAlign w:val="center"/>
           </w:tcPr>
           <w:p>
-            <w:r>
-              <w:rPr>
-                <w:sz w:val="22"/>
-                <w:szCs w:val="22"/>
-              </w:rPr>
-              <w:t>VPasCode (Visual Paradigm)</w:t>
+            <w:proofErr w:type="spellStart"/>
+            <w:r>
+              <w:rPr>
+                <w:sz w:val="22"/>
+                <w:szCs w:val="22"/>
+              </w:rPr>
+              <w:t>VPasCode</w:t>
+            </w:r>
+            <w:proofErr w:type="spellEnd"/>
+            <w:r>
+              <w:rPr>
+                <w:sz w:val="22"/>
+                <w:szCs w:val="22"/>
+              </w:rPr>
+              <w:t xml:space="preserve"> (Visual </w:t>
+            </w:r>
+            <w:proofErr w:type="spellStart"/>
+            <w:r>
+              <w:rPr>
+                <w:sz w:val="22"/>
+                <w:szCs w:val="22"/>
+              </w:rPr>
+              <w:t>Paradigm</w:t>
+            </w:r>
+            <w:proofErr w:type="spellEnd"/>
+            <w:r>
+              <w:rPr>
+                <w:sz w:val="22"/>
+                <w:szCs w:val="22"/>
+              </w:rPr>
+              <w:t>)</w:t>
             </w:r>
           </w:p>
         </w:tc>
@@ -3272,26 +3305,62 @@
       <w:r>
         <w:t>Sebagai seorang Program Pemula (</w:t>
       </w:r>
+      <w:proofErr w:type="spellStart"/>
       <w:r>
         <w:rPr>
           <w:i/>
           <w:iCs/>
         </w:rPr>
-        <w:t>Novice Programmer</w:t>
-      </w:r>
-      <w:r>
-        <w:t xml:space="preserve">) pada sebuah Perusahaan </w:t>
-      </w:r>
+        <w:t>Novice</w:t>
+      </w:r>
+      <w:proofErr w:type="spellEnd"/>
       <w:r>
         <w:rPr>
           <w:i/>
           <w:iCs/>
         </w:rPr>
-        <w:t>Software Developer</w:t>
-      </w:r>
-      <w:r>
-        <w:t xml:space="preserve">, anda ditugaskan sebagai </w:t>
-      </w:r>
+        <w:t xml:space="preserve"> </w:t>
+      </w:r>
+      <w:proofErr w:type="spellStart"/>
+      <w:r>
+        <w:rPr>
+          <w:i/>
+          <w:iCs/>
+        </w:rPr>
+        <w:t>Programmer</w:t>
+      </w:r>
+      <w:proofErr w:type="spellEnd"/>
+      <w:r>
+        <w:t xml:space="preserve">) pada sebuah Perusahaan </w:t>
+      </w:r>
+      <w:proofErr w:type="spellStart"/>
+      <w:r>
+        <w:rPr>
+          <w:i/>
+          <w:iCs/>
+        </w:rPr>
+        <w:t>Software</w:t>
+      </w:r>
+      <w:proofErr w:type="spellEnd"/>
+      <w:r>
+        <w:rPr>
+          <w:i/>
+          <w:iCs/>
+        </w:rPr>
+        <w:t xml:space="preserve"> Developer</w:t>
+      </w:r>
+      <w:r>
+        <w:t xml:space="preserve">, </w:t>
+      </w:r>
+      <w:proofErr w:type="spellStart"/>
+      <w:r>
+        <w:t>anda</w:t>
+      </w:r>
+      <w:proofErr w:type="spellEnd"/>
+      <w:r>
+        <w:t xml:space="preserve"> ditugaskan sebagai </w:t>
+      </w:r>
+      <w:proofErr w:type="spellStart"/>
       <w:r>
         <w:rPr>
           <w:b/>
@@ -3301,8 +3370,17 @@
         </w:rPr>
         <w:t>programmer</w:t>
       </w:r>
-      <w:r>
-        <w:t>, anda diminta untuk membuat sebuah Aplikasi Parkir.</w:t>
+      <w:proofErr w:type="spellEnd"/>
+      <w:r>
+        <w:t xml:space="preserve">, </w:t>
+      </w:r>
+      <w:proofErr w:type="spellStart"/>
+      <w:r>
+        <w:t>anda</w:t>
+      </w:r>
+      <w:proofErr w:type="spellEnd"/>
+      <w:r>
+        <w:t xml:space="preserve"> diminta untuk membuat sebuah Aplikasi Parkir.</w:t>
       </w:r>
     </w:p>
     <w:p>
@@ -3373,6 +3451,7 @@
       <w:r>
         <w:t xml:space="preserve">Skema </w:t>
       </w:r>
+      <w:proofErr w:type="spellStart"/>
       <w:r>
         <w:rPr>
           <w:i/>
@@ -3380,6 +3459,7 @@
         </w:rPr>
         <w:t>Database</w:t>
       </w:r>
+      <w:proofErr w:type="spellEnd"/>
       <w:r>
         <w:t xml:space="preserve"> Aplikasi Parkir</w:t>
       </w:r>
@@ -3397,7 +3477,147 @@
           <w:sz w:val="20"/>
           <w:szCs w:val="20"/>
         </w:rPr>
-        <w:t>Catatan: tabel tb_kendaraan pada skema awal dikembangkan menjadi tb_member dan tb_parkir (data kendaraan dicatat per kunjungan, sehingga non-member tetap tercatat). Kolom snapshot pada tb_transaksi menjaga struk lama tetap utuh.</w:t>
+        <w:t xml:space="preserve">Catatan: tabel </w:t>
+      </w:r>
+      <w:proofErr w:type="spellStart"/>
+      <w:r>
+        <w:rPr>
+          <w:i/>
+          <w:iCs/>
+          <w:sz w:val="20"/>
+          <w:szCs w:val="20"/>
+        </w:rPr>
+        <w:t>tb_kendaraan</w:t>
+      </w:r>
+      <w:proofErr w:type="spellEnd"/>
+      <w:r>
+        <w:rPr>
+          <w:i/>
+          <w:iCs/>
+          <w:sz w:val="20"/>
+          <w:szCs w:val="20"/>
+        </w:rPr>
+        <w:t xml:space="preserve"> pada skema awal dikembangkan menjadi </w:t>
+      </w:r>
+      <w:proofErr w:type="spellStart"/>
+      <w:r>
+        <w:rPr>
+          <w:i/>
+          <w:iCs/>
+          <w:sz w:val="20"/>
+          <w:szCs w:val="20"/>
+        </w:rPr>
+        <w:t>tb_member</w:t>
+      </w:r>
+      <w:proofErr w:type="spellEnd"/>
+      <w:r>
+        <w:rPr>
+          <w:i/>
+          <w:iCs/>
+          <w:sz w:val="20"/>
+          <w:szCs w:val="20"/>
+        </w:rPr>
+        <w:t xml:space="preserve"> dan </w:t>
+      </w:r>
+      <w:proofErr w:type="spellStart"/>
+      <w:r>
+        <w:rPr>
+          <w:i/>
+          <w:iCs/>
+          <w:sz w:val="20"/>
+          <w:szCs w:val="20"/>
+        </w:rPr>
+        <w:t>tb_parkir</w:t>
+      </w:r>
+      <w:proofErr w:type="spellEnd"/>
+      <w:r>
+        <w:rPr>
+          <w:i/>
+          <w:iCs/>
+          <w:sz w:val="20"/>
+          <w:szCs w:val="20"/>
+        </w:rPr>
+        <w:t xml:space="preserve"> (data kendaraan dicatat per kunjungan, sehingga non-</w:t>
+      </w:r>
+      <w:proofErr w:type="spellStart"/>
+      <w:r>
+        <w:rPr>
+          <w:i/>
+          <w:iCs/>
+          <w:sz w:val="20"/>
+          <w:szCs w:val="20"/>
+        </w:rPr>
+        <w:t>member</w:t>
+      </w:r>
+      <w:proofErr w:type="spellEnd"/>
+      <w:r>
+        <w:rPr>
+          <w:i/>
+          <w:iCs/>
+          <w:sz w:val="20"/>
+          <w:szCs w:val="20"/>
+        </w:rPr>
+        <w:t xml:space="preserve"> tetap tercatat). Kolom </w:t>
+      </w:r>
+      <w:proofErr w:type="spellStart"/>
+      <w:r>
+        <w:rPr>
+          <w:i/>
+          <w:iCs/>
+          <w:sz w:val="20"/>
+          <w:szCs w:val="20"/>
+        </w:rPr>
+        <w:t>snapshot</w:t>
+      </w:r>
+      <w:proofErr w:type="spellEnd"/>
+      <w:r>
+        <w:rPr>
+          <w:i/>
+          <w:iCs/>
+          <w:sz w:val="20"/>
+          <w:szCs w:val="20"/>
+        </w:rPr>
+        <w:t xml:space="preserve"> pada </w:t>
+      </w:r>
+      <w:proofErr w:type="spellStart"/>
+      <w:r>
+        <w:rPr>
+          <w:i/>
+          <w:iCs/>
+          <w:sz w:val="20"/>
+          <w:szCs w:val="20"/>
+        </w:rPr>
+        <w:t>tb_transaksi</w:t>
+      </w:r>
+      <w:proofErr w:type="spellEnd"/>
+      <w:r>
+        <w:rPr>
+          <w:i/>
+          <w:iCs/>
+          <w:sz w:val="20"/>
+          <w:szCs w:val="20"/>
+        </w:rPr>
+        <w:t xml:space="preserve"> menjaga </w:t>
+      </w:r>
+      <w:proofErr w:type="spellStart"/>
+      <w:r>
+        <w:rPr>
+          <w:i/>
+          <w:iCs/>
+          <w:sz w:val="20"/>
+          <w:szCs w:val="20"/>
+        </w:rPr>
+        <w:t>struk</w:t>
+      </w:r>
+      <w:proofErr w:type="spellEnd"/>
+      <w:r>
+        <w:rPr>
+          <w:i/>
+          <w:iCs/>
+          <w:sz w:val="20"/>
+          <w:szCs w:val="20"/>
+        </w:rPr>
+        <w:t xml:space="preserve"> lama tetap utuh.</w:t>
       </w:r>
     </w:p>
     <w:p>
@@ -3435,12 +3655,6 @@
         <w:gridCol w:w="1200"/>
       </w:tblGrid>
       <w:tr>
-        <w:tblPrEx>
-          <w:tblCellMar>
-            <w:top w:w="0" w:type="dxa"/>
-            <w:bottom w:w="0" w:type="dxa"/>
-          </w:tblCellMar>
-        </w:tblPrEx>
         <w:trPr>
           <w:tblHeader/>
           <w:jc w:val="center"/>
@@ -3566,6 +3780,7 @@
             <w:pPr>
               <w:jc w:val="center"/>
             </w:pPr>
+            <w:proofErr w:type="spellStart"/>
             <w:r>
               <w:rPr>
                 <w:b/>
@@ -3575,16 +3790,11 @@
               </w:rPr>
               <w:t>Owner</w:t>
             </w:r>
+            <w:proofErr w:type="spellEnd"/>
           </w:p>
         </w:tc>
       </w:tr>
       <w:tr>
-        <w:tblPrEx>
-          <w:tblCellMar>
-            <w:top w:w="0" w:type="dxa"/>
-            <w:bottom w:w="0" w:type="dxa"/>
-          </w:tblCellMar>
-        </w:tblPrEx>
         <w:trPr>
           <w:cantSplit/>
           <w:jc w:val="center"/>
@@ -3610,6 +3820,7 @@
             <w:pPr>
               <w:jc w:val="center"/>
             </w:pPr>
+            <w:proofErr w:type="spellStart"/>
             <w:r>
               <w:rPr>
                 <w:i/>
@@ -3617,6 +3828,7 @@
               </w:rPr>
               <w:t>Login</w:t>
             </w:r>
+            <w:proofErr w:type="spellEnd"/>
           </w:p>
         </w:tc>
         <w:tc>
@@ -3711,12 +3923,6 @@
         </w:tc>
       </w:tr>
       <w:tr>
-        <w:tblPrEx>
-          <w:tblCellMar>
-            <w:top w:w="0" w:type="dxa"/>
-            <w:bottom w:w="0" w:type="dxa"/>
-          </w:tblCellMar>
-        </w:tblPrEx>
         <w:trPr>
           <w:cantSplit/>
           <w:jc w:val="center"/>
@@ -3742,6 +3948,7 @@
             <w:pPr>
               <w:jc w:val="center"/>
             </w:pPr>
+            <w:proofErr w:type="spellStart"/>
             <w:r>
               <w:rPr>
                 <w:i/>
@@ -3749,6 +3956,7 @@
               </w:rPr>
               <w:t>Logout</w:t>
             </w:r>
+            <w:proofErr w:type="spellEnd"/>
           </w:p>
         </w:tc>
         <w:tc>
@@ -3843,12 +4051,6 @@
         </w:tc>
       </w:tr>
       <w:tr>
-        <w:tblPrEx>
-          <w:tblCellMar>
-            <w:top w:w="0" w:type="dxa"/>
-            <w:bottom w:w="0" w:type="dxa"/>
-          </w:tblCellMar>
-        </w:tblPrEx>
         <w:trPr>
           <w:cantSplit/>
           <w:jc w:val="center"/>
@@ -3879,8 +4081,17 @@
                 <w:sz w:val="22"/>
                 <w:szCs w:val="22"/>
               </w:rPr>
-              <w:t>CRUD User</w:t>
-            </w:r>
+              <w:t xml:space="preserve">CRUD </w:t>
+            </w:r>
+            <w:proofErr w:type="spellStart"/>
+            <w:r>
+              <w:rPr>
+                <w:sz w:val="22"/>
+                <w:szCs w:val="22"/>
+              </w:rPr>
+              <w:t>User</w:t>
+            </w:r>
+            <w:proofErr w:type="spellEnd"/>
           </w:p>
         </w:tc>
         <w:tc>
@@ -3961,12 +4172,6 @@
         </w:tc>
       </w:tr>
       <w:tr>
-        <w:tblPrEx>
-          <w:tblCellMar>
-            <w:top w:w="0" w:type="dxa"/>
-            <w:bottom w:w="0" w:type="dxa"/>
-          </w:tblCellMar>
-        </w:tblPrEx>
         <w:trPr>
           <w:cantSplit/>
           <w:jc w:val="center"/>
@@ -3997,7 +4202,23 @@
                 <w:sz w:val="22"/>
                 <w:szCs w:val="22"/>
               </w:rPr>
-              <w:t>CRUD Tarif Parkir (termasuk diskon member)</w:t>
+              <w:t xml:space="preserve">CRUD Tarif Parkir (termasuk diskon </w:t>
+            </w:r>
+            <w:proofErr w:type="spellStart"/>
+            <w:r>
+              <w:rPr>
+                <w:sz w:val="22"/>
+                <w:szCs w:val="22"/>
+              </w:rPr>
+              <w:t>member</w:t>
+            </w:r>
+            <w:proofErr w:type="spellEnd"/>
+            <w:r>
+              <w:rPr>
+                <w:sz w:val="22"/>
+                <w:szCs w:val="22"/>
+              </w:rPr>
+              <w:t>)</w:t>
             </w:r>
           </w:p>
         </w:tc>
@@ -4079,12 +4300,6 @@
         </w:tc>
       </w:tr>
       <w:tr>
-        <w:tblPrEx>
-          <w:tblCellMar>
-            <w:top w:w="0" w:type="dxa"/>
-            <w:bottom w:w="0" w:type="dxa"/>
-          </w:tblCellMar>
-        </w:tblPrEx>
         <w:trPr>
           <w:cantSplit/>
           <w:jc w:val="center"/>
@@ -4197,12 +4412,6 @@
         </w:tc>
       </w:tr>
       <w:tr>
-        <w:tblPrEx>
-          <w:tblCellMar>
-            <w:top w:w="0" w:type="dxa"/>
-            <w:bottom w:w="0" w:type="dxa"/>
-          </w:tblCellMar>
-        </w:tblPrEx>
         <w:trPr>
           <w:cantSplit/>
           <w:jc w:val="center"/>
@@ -4315,12 +4524,6 @@
         </w:tc>
       </w:tr>
       <w:tr>
-        <w:tblPrEx>
-          <w:tblCellMar>
-            <w:top w:w="0" w:type="dxa"/>
-            <w:bottom w:w="0" w:type="dxa"/>
-          </w:tblCellMar>
-        </w:tblPrEx>
         <w:trPr>
           <w:cantSplit/>
           <w:jc w:val="center"/>
@@ -4433,12 +4636,6 @@
         </w:tc>
       </w:tr>
       <w:tr>
-        <w:tblPrEx>
-          <w:tblCellMar>
-            <w:top w:w="0" w:type="dxa"/>
-            <w:bottom w:w="0" w:type="dxa"/>
-          </w:tblCellMar>
-        </w:tblPrEx>
         <w:trPr>
           <w:cantSplit/>
           <w:jc w:val="center"/>
@@ -4464,12 +4661,21 @@
             <w:pPr>
               <w:jc w:val="center"/>
             </w:pPr>
-            <w:r>
-              <w:rPr>
-                <w:sz w:val="22"/>
-                <w:szCs w:val="22"/>
-              </w:rPr>
-              <w:t>Check-in kendaraan</w:t>
+            <w:proofErr w:type="spellStart"/>
+            <w:r>
+              <w:rPr>
+                <w:sz w:val="22"/>
+                <w:szCs w:val="22"/>
+              </w:rPr>
+              <w:t>Check</w:t>
+            </w:r>
+            <w:proofErr w:type="spellEnd"/>
+            <w:r>
+              <w:rPr>
+                <w:sz w:val="22"/>
+                <w:szCs w:val="22"/>
+              </w:rPr>
+              <w:t>-in kendaraan</w:t>
             </w:r>
           </w:p>
         </w:tc>
@@ -4551,12 +4757,6 @@
         </w:tc>
       </w:tr>
       <w:tr>
-        <w:tblPrEx>
-          <w:tblCellMar>
-            <w:top w:w="0" w:type="dxa"/>
-            <w:bottom w:w="0" w:type="dxa"/>
-          </w:tblCellMar>
-        </w:tblPrEx>
         <w:trPr>
           <w:cantSplit/>
           <w:jc w:val="center"/>
@@ -4582,13 +4782,22 @@
             <w:pPr>
               <w:jc w:val="center"/>
             </w:pPr>
+            <w:proofErr w:type="spellStart"/>
             <w:r>
               <w:rPr>
                 <w:sz w:val="22"/>
                 <w:szCs w:val="22"/>
               </w:rPr>
               <w:lastRenderedPageBreak/>
-              <w:t>Check-out dan konfirmasi biaya</w:t>
+              <w:t>Check-out</w:t>
+            </w:r>
+            <w:proofErr w:type="spellEnd"/>
+            <w:r>
+              <w:rPr>
+                <w:sz w:val="22"/>
+                <w:szCs w:val="22"/>
+              </w:rPr>
+              <w:t xml:space="preserve"> dan konfirmasi biaya</w:t>
             </w:r>
           </w:p>
         </w:tc>
@@ -4670,12 +4879,6 @@
         </w:tc>
       </w:tr>
       <w:tr>
-        <w:tblPrEx>
-          <w:tblCellMar>
-            <w:top w:w="0" w:type="dxa"/>
-            <w:bottom w:w="0" w:type="dxa"/>
-          </w:tblCellMar>
-        </w:tblPrEx>
         <w:trPr>
           <w:cantSplit/>
           <w:jc w:val="center"/>
@@ -4706,7 +4909,23 @@
                 <w:sz w:val="22"/>
                 <w:szCs w:val="22"/>
               </w:rPr>
-              <w:t>Cetak struk parkir</w:t>
+              <w:t xml:space="preserve">Cetak </w:t>
+            </w:r>
+            <w:proofErr w:type="spellStart"/>
+            <w:r>
+              <w:rPr>
+                <w:sz w:val="22"/>
+                <w:szCs w:val="22"/>
+              </w:rPr>
+              <w:t>struk</w:t>
+            </w:r>
+            <w:proofErr w:type="spellEnd"/>
+            <w:r>
+              <w:rPr>
+                <w:sz w:val="22"/>
+                <w:szCs w:val="22"/>
+              </w:rPr>
+              <w:t xml:space="preserve"> parkir</w:t>
             </w:r>
           </w:p>
         </w:tc>
@@ -4788,12 +5007,6 @@
         </w:tc>
       </w:tr>
       <w:tr>
-        <w:tblPrEx>
-          <w:tblCellMar>
-            <w:top w:w="0" w:type="dxa"/>
-            <w:bottom w:w="0" w:type="dxa"/>
-          </w:tblCellMar>
-        </w:tblPrEx>
         <w:trPr>
           <w:cantSplit/>
           <w:jc w:val="center"/>
@@ -4906,12 +5119,6 @@
         </w:tc>
       </w:tr>
       <w:tr>
-        <w:tblPrEx>
-          <w:tblCellMar>
-            <w:top w:w="0" w:type="dxa"/>
-            <w:bottom w:w="0" w:type="dxa"/>
-          </w:tblCellMar>
-        </w:tblPrEx>
         <w:trPr>
           <w:cantSplit/>
           <w:jc w:val="center"/>
@@ -5024,12 +5231,6 @@
         </w:tc>
       </w:tr>
       <w:tr>
-        <w:tblPrEx>
-          <w:tblCellMar>
-            <w:top w:w="0" w:type="dxa"/>
-            <w:bottom w:w="0" w:type="dxa"/>
-          </w:tblCellMar>
-        </w:tblPrEx>
         <w:trPr>
           <w:cantSplit/>
           <w:jc w:val="center"/>
@@ -5060,8 +5261,33 @@
                 <w:sz w:val="22"/>
                 <w:szCs w:val="22"/>
               </w:rPr>
-              <w:t>Rekap pendapatan member dan non-member</w:t>
-            </w:r>
+              <w:t xml:space="preserve">Rekap pendapatan </w:t>
+            </w:r>
+            <w:proofErr w:type="spellStart"/>
+            <w:r>
+              <w:rPr>
+                <w:sz w:val="22"/>
+                <w:szCs w:val="22"/>
+              </w:rPr>
+              <w:t>member</w:t>
+            </w:r>
+            <w:proofErr w:type="spellEnd"/>
+            <w:r>
+              <w:rPr>
+                <w:sz w:val="22"/>
+                <w:szCs w:val="22"/>
+              </w:rPr>
+              <w:t xml:space="preserve"> dan non-</w:t>
+            </w:r>
+            <w:proofErr w:type="spellStart"/>
+            <w:r>
+              <w:rPr>
+                <w:sz w:val="22"/>
+                <w:szCs w:val="22"/>
+              </w:rPr>
+              <w:t>member</w:t>
+            </w:r>
+            <w:proofErr w:type="spellEnd"/>
           </w:p>
         </w:tc>
         <w:tc>
@@ -5164,7 +5390,23 @@
         <w:jc w:val="both"/>
       </w:pPr>
       <w:r>
-        <w:t>Aplikasi mendukung dua jenis parkir, yaitu member dan non-member. Member memperoleh diskon tarif dan menempati area sesuai peruntukannya.</w:t>
+        <w:t xml:space="preserve">Aplikasi mendukung dua jenis parkir, yaitu </w:t>
+      </w:r>
+      <w:proofErr w:type="spellStart"/>
+      <w:r>
+        <w:t>member</w:t>
+      </w:r>
+      <w:proofErr w:type="spellEnd"/>
+      <w:r>
+        <w:t xml:space="preserve"> dan non-</w:t>
+      </w:r>
+      <w:proofErr w:type="spellStart"/>
+      <w:r>
+        <w:t>member</w:t>
+      </w:r>
+      <w:proofErr w:type="spellEnd"/>
+      <w:r>
+        <w:t>. Member memperoleh diskon tarif dan menempati area sesuai peruntukannya.</w:t>
       </w:r>
     </w:p>
     <w:p>
@@ -5178,7 +5420,15 @@
         <w:jc w:val="both"/>
       </w:pPr>
       <w:r>
-        <w:t>Setiap area parkir memiliki peruntukan (Member, Non-member, atau Campuran) dan kapasitas yang dibagi bersama oleh kendaraan yang diizinkan masuk.</w:t>
+        <w:t>Setiap area parkir memiliki peruntukan (Member, Non-</w:t>
+      </w:r>
+      <w:proofErr w:type="spellStart"/>
+      <w:r>
+        <w:t>member</w:t>
+      </w:r>
+      <w:proofErr w:type="spellEnd"/>
+      <w:r>
+        <w:t>, atau Campuran) dan kapasitas yang dibagi bersama oleh kendaraan yang diizinkan masuk.</w:t>
       </w:r>
     </w:p>
     <w:p>
@@ -5205,8 +5455,21 @@
         <w:spacing w:after="40"/>
         <w:jc w:val="both"/>
       </w:pPr>
-      <w:r>
-        <w:t>Check-out menampilkan halaman konfirmasi biaya sebelum transaksi disimpan, dan data transaksi disimpan dalam bentuk snapshot.</w:t>
+      <w:proofErr w:type="spellStart"/>
+      <w:r>
+        <w:t>Check-out</w:t>
+      </w:r>
+      <w:proofErr w:type="spellEnd"/>
+      <w:r>
+        <w:t xml:space="preserve"> menampilkan halaman konfirmasi biaya sebelum transaksi disimpan, dan data transaksi disimpan dalam bentuk </w:t>
+      </w:r>
+      <w:proofErr w:type="spellStart"/>
+      <w:r>
+        <w:t>snapshot</w:t>
+      </w:r>
+      <w:proofErr w:type="spellEnd"/>
+      <w:r>
+        <w:t>.</w:t>
       </w:r>
     </w:p>
     <w:p>
@@ -5247,8 +5510,13 @@
         <w:spacing w:after="40"/>
       </w:pPr>
       <w:r>
-        <w:t>Siapkan lingkungan kerja dengan mempersiapkan komputer yang akan di-install</w:t>
-      </w:r>
+        <w:t xml:space="preserve">Siapkan lingkungan kerja dengan mempersiapkan komputer yang akan </w:t>
+      </w:r>
+      <w:proofErr w:type="spellStart"/>
+      <w:r>
+        <w:t>di-install</w:t>
+      </w:r>
+      <w:proofErr w:type="spellEnd"/>
     </w:p>
     <w:p>
       <w:pPr>
@@ -5273,7 +5541,15 @@
         <w:spacing w:after="40"/>
       </w:pPr>
       <w:r>
-        <w:t>Lakukan instalasi software aplikasi yang akan digunakan</w:t>
+        <w:t xml:space="preserve">Lakukan instalasi </w:t>
+      </w:r>
+      <w:proofErr w:type="spellStart"/>
+      <w:r>
+        <w:t>software</w:t>
+      </w:r>
+      <w:proofErr w:type="spellEnd"/>
+      <w:r>
+        <w:t xml:space="preserve"> aplikasi yang akan digunakan</w:t>
       </w:r>
     </w:p>
     <w:p>
@@ -5286,7 +5562,15 @@
         <w:spacing w:after="40"/>
       </w:pPr>
       <w:r>
-        <w:t>Pastikan sistem operasi dan software aplikasi berjalan dengan baik</w:t>
+        <w:t xml:space="preserve">Pastikan sistem operasi dan </w:t>
+      </w:r>
+      <w:proofErr w:type="spellStart"/>
+      <w:r>
+        <w:t>software</w:t>
+      </w:r>
+      <w:proofErr w:type="spellEnd"/>
+      <w:r>
+        <w:t xml:space="preserve"> aplikasi berjalan dengan baik</w:t>
       </w:r>
     </w:p>
     <w:p>
@@ -5299,7 +5583,15 @@
         <w:spacing w:after="40"/>
       </w:pPr>
       <w:r>
-        <w:t>Buatlah struktur data dan akses terhadap struktur data termasuk dengan tipe data dan control program untuk aplikasi</w:t>
+        <w:t xml:space="preserve">Buatlah struktur data dan akses terhadap struktur data termasuk dengan tipe data dan </w:t>
+      </w:r>
+      <w:proofErr w:type="spellStart"/>
+      <w:r>
+        <w:t>control</w:t>
+      </w:r>
+      <w:proofErr w:type="spellEnd"/>
+      <w:r>
+        <w:t xml:space="preserve"> program untuk aplikasi</w:t>
       </w:r>
     </w:p>
     <w:p>
@@ -5312,7 +5604,23 @@
         <w:spacing w:after="40"/>
       </w:pPr>
       <w:r>
-        <w:t>Gunakan metode Waterfall sederhana atau prototype:</w:t>
+        <w:t xml:space="preserve">Gunakan metode </w:t>
+      </w:r>
+      <w:proofErr w:type="spellStart"/>
+      <w:r>
+        <w:t>Waterfall</w:t>
+      </w:r>
+      <w:proofErr w:type="spellEnd"/>
+      <w:r>
+        <w:t xml:space="preserve"> sederhana atau </w:t>
+      </w:r>
+      <w:proofErr w:type="spellStart"/>
+      <w:r>
+        <w:t>prototype</w:t>
+      </w:r>
+      <w:proofErr w:type="spellEnd"/>
+      <w:r>
+        <w:t>:</w:t>
       </w:r>
     </w:p>
     <w:p>
@@ -5338,7 +5646,55 @@
         <w:spacing w:after="40"/>
       </w:pPr>
       <w:r>
-        <w:t>Desain (ERD dan diagram program: use case, activity, flowchart, sequence, dan class)</w:t>
+        <w:t xml:space="preserve">Desain (ERD dan diagram program: </w:t>
+      </w:r>
+      <w:proofErr w:type="spellStart"/>
+      <w:r>
+        <w:t>use</w:t>
+      </w:r>
+      <w:proofErr w:type="spellEnd"/>
+      <w:r>
+        <w:t xml:space="preserve"> </w:t>
+      </w:r>
+      <w:proofErr w:type="spellStart"/>
+      <w:r>
+        <w:t>case</w:t>
+      </w:r>
+      <w:proofErr w:type="spellEnd"/>
+      <w:r>
+        <w:t xml:space="preserve">, </w:t>
+      </w:r>
+      <w:proofErr w:type="spellStart"/>
+      <w:r>
+        <w:t>activity</w:t>
+      </w:r>
+      <w:proofErr w:type="spellEnd"/>
+      <w:r>
+        <w:t xml:space="preserve">, </w:t>
+      </w:r>
+      <w:proofErr w:type="spellStart"/>
+      <w:r>
+        <w:t>flowchart</w:t>
+      </w:r>
+      <w:proofErr w:type="spellEnd"/>
+      <w:r>
+        <w:t xml:space="preserve">, </w:t>
+      </w:r>
+      <w:proofErr w:type="spellStart"/>
+      <w:r>
+        <w:t>sequence</w:t>
+      </w:r>
+      <w:proofErr w:type="spellEnd"/>
+      <w:r>
+        <w:t xml:space="preserve">, dan </w:t>
+      </w:r>
+      <w:proofErr w:type="spellStart"/>
+      <w:r>
+        <w:t>class</w:t>
+      </w:r>
+      <w:proofErr w:type="spellEnd"/>
+      <w:r>
+        <w:t>)</w:t>
       </w:r>
     </w:p>
     <w:p>
@@ -5364,7 +5720,23 @@
         <w:spacing w:after="40"/>
       </w:pPr>
       <w:r>
-        <w:t>Pengujian (black box)</w:t>
+        <w:t>Pengujian (</w:t>
+      </w:r>
+      <w:proofErr w:type="spellStart"/>
+      <w:r>
+        <w:t>black</w:t>
+      </w:r>
+      <w:proofErr w:type="spellEnd"/>
+      <w:r>
+        <w:t xml:space="preserve"> </w:t>
+      </w:r>
+      <w:proofErr w:type="spellStart"/>
+      <w:r>
+        <w:t>box</w:t>
+      </w:r>
+      <w:proofErr w:type="spellEnd"/>
+      <w:r>
+        <w:t>)</w:t>
       </w:r>
     </w:p>
     <w:p>
@@ -5390,7 +5762,23 @@
         <w:spacing w:after="40"/>
       </w:pPr>
       <w:r>
-        <w:t>Buatlah deskripsi dan diagram alur (flowchart) atau pseudocode untuk minimal:</w:t>
+        <w:t>Buatlah deskripsi dan diagram alur (</w:t>
+      </w:r>
+      <w:proofErr w:type="spellStart"/>
+      <w:r>
+        <w:t>flowchart</w:t>
+      </w:r>
+      <w:proofErr w:type="spellEnd"/>
+      <w:r>
+        <w:t xml:space="preserve">) atau </w:t>
+      </w:r>
+      <w:proofErr w:type="spellStart"/>
+      <w:r>
+        <w:t>pseudocode</w:t>
+      </w:r>
+      <w:proofErr w:type="spellEnd"/>
+      <w:r>
+        <w:t xml:space="preserve"> untuk minimal:</w:t>
       </w:r>
     </w:p>
     <w:p>
@@ -5403,8 +5791,13 @@
         <w:spacing w:after="40"/>
       </w:pPr>
       <w:r>
-        <w:t>Proses login</w:t>
-      </w:r>
+        <w:t xml:space="preserve">Proses </w:t>
+      </w:r>
+      <w:proofErr w:type="spellStart"/>
+      <w:r>
+        <w:t>login</w:t>
+      </w:r>
+      <w:proofErr w:type="spellEnd"/>
     </w:p>
     <w:p>
       <w:pPr>
@@ -5429,8 +5822,13 @@
         <w:spacing w:after="40"/>
       </w:pPr>
       <w:r>
-        <w:t>Cetak struk</w:t>
-      </w:r>
+        <w:t xml:space="preserve">Cetak </w:t>
+      </w:r>
+      <w:proofErr w:type="spellStart"/>
+      <w:r>
+        <w:t>struk</w:t>
+      </w:r>
+      <w:proofErr w:type="spellEnd"/>
     </w:p>
     <w:p>
       <w:pPr>
@@ -5442,7 +5840,31 @@
         <w:spacing w:after="40"/>
       </w:pPr>
       <w:r>
-        <w:t>Buat dokumentasi terpisah untuk setiap modul (tuliskan input, proses dan output) untuk setiap proses beserta fungsi, prosedur dan method.</w:t>
+        <w:t xml:space="preserve">Buat dokumentasi terpisah untuk setiap modul (tuliskan </w:t>
+      </w:r>
+      <w:proofErr w:type="spellStart"/>
+      <w:r>
+        <w:t>input</w:t>
+      </w:r>
+      <w:proofErr w:type="spellEnd"/>
+      <w:r>
+        <w:t xml:space="preserve">, proses dan </w:t>
+      </w:r>
+      <w:proofErr w:type="spellStart"/>
+      <w:r>
+        <w:t>output</w:t>
+      </w:r>
+      <w:proofErr w:type="spellEnd"/>
+      <w:r>
+        <w:t xml:space="preserve">) untuk setiap proses beserta fungsi, prosedur dan </w:t>
+      </w:r>
+      <w:proofErr w:type="spellStart"/>
+      <w:r>
+        <w:t>method</w:t>
+      </w:r>
+      <w:proofErr w:type="spellEnd"/>
+      <w:r>
+        <w:t>.</w:t>
       </w:r>
     </w:p>
     <w:p>
@@ -5455,8 +5877,13 @@
         <w:spacing w:after="40"/>
       </w:pPr>
       <w:r>
-        <w:t>Dengan menggunakan ERD yang dibuat dari poin 6b silakan mulai membuat database</w:t>
-      </w:r>
+        <w:t xml:space="preserve">Dengan menggunakan ERD yang dibuat dari poin 6b silakan mulai membuat </w:t>
+      </w:r>
+      <w:proofErr w:type="spellStart"/>
+      <w:r>
+        <w:t>database</w:t>
+      </w:r>
+      <w:proofErr w:type="spellEnd"/>
     </w:p>
     <w:p>
       <w:pPr>
@@ -5468,7 +5895,23 @@
         <w:spacing w:after="40"/>
       </w:pPr>
       <w:r>
-        <w:t>Buat Folder projek, jalankan semua aplikasi yang programmer perlukan</w:t>
+        <w:t xml:space="preserve">Buat Folder </w:t>
+      </w:r>
+      <w:proofErr w:type="spellStart"/>
+      <w:r>
+        <w:t>projek</w:t>
+      </w:r>
+      <w:proofErr w:type="spellEnd"/>
+      <w:r>
+        <w:t xml:space="preserve">, jalankan semua aplikasi yang </w:t>
+      </w:r>
+      <w:proofErr w:type="spellStart"/>
+      <w:r>
+        <w:t>programmer</w:t>
+      </w:r>
+      <w:proofErr w:type="spellEnd"/>
+      <w:r>
+        <w:t xml:space="preserve"> perlukan</w:t>
       </w:r>
     </w:p>
     <w:p>
@@ -5481,7 +5924,31 @@
         <w:spacing w:after="40"/>
       </w:pPr>
       <w:r>
-        <w:t>Buatlah aplikasi dengan memperhatikan Coding Guidelines dan Best Practices.</w:t>
+        <w:t xml:space="preserve">Buatlah aplikasi dengan memperhatikan </w:t>
+      </w:r>
+      <w:proofErr w:type="spellStart"/>
+      <w:r>
+        <w:t>Coding</w:t>
+      </w:r>
+      <w:proofErr w:type="spellEnd"/>
+      <w:r>
+        <w:t xml:space="preserve"> </w:t>
+      </w:r>
+      <w:proofErr w:type="spellStart"/>
+      <w:r>
+        <w:t>Guidelines</w:t>
+      </w:r>
+      <w:proofErr w:type="spellEnd"/>
+      <w:r>
+        <w:t xml:space="preserve"> dan Best </w:t>
+      </w:r>
+      <w:proofErr w:type="spellStart"/>
+      <w:r>
+        <w:t>Practices</w:t>
+      </w:r>
+      <w:proofErr w:type="spellEnd"/>
+      <w:r>
+        <w:t>.</w:t>
       </w:r>
     </w:p>
     <w:p>
@@ -5503,7 +5970,15 @@
         <w:spacing w:after="40"/>
       </w:pPr>
       <w:r>
-        <w:t>Pastikan halaman memuat dengan cepat (gunakan query yang efisien)</w:t>
+        <w:t xml:space="preserve">Pastikan halaman memuat dengan cepat (gunakan </w:t>
+      </w:r>
+      <w:proofErr w:type="spellStart"/>
+      <w:r>
+        <w:t>query</w:t>
+      </w:r>
+      <w:proofErr w:type="spellEnd"/>
+      <w:r>
+        <w:t xml:space="preserve"> yang efisien)</w:t>
       </w:r>
     </w:p>
     <w:p>
@@ -5529,8 +6004,13 @@
         <w:spacing w:after="40"/>
       </w:pPr>
       <w:r>
-        <w:t>Gunakan array</w:t>
-      </w:r>
+        <w:t xml:space="preserve">Gunakan </w:t>
+      </w:r>
+      <w:proofErr w:type="spellStart"/>
+      <w:r>
+        <w:t>array</w:t>
+      </w:r>
+      <w:proofErr w:type="spellEnd"/>
     </w:p>
     <w:p>
       <w:pPr>
@@ -5543,7 +6023,15 @@
       </w:pPr>
       <w:r>
         <w:lastRenderedPageBreak/>
-        <w:t>Hindari looping yang tidak perlu</w:t>
+        <w:t xml:space="preserve">Hindari </w:t>
+      </w:r>
+      <w:proofErr w:type="spellStart"/>
+      <w:r>
+        <w:t>looping</w:t>
+      </w:r>
+      <w:proofErr w:type="spellEnd"/>
+      <w:r>
+        <w:t xml:space="preserve"> yang tidak perlu</w:t>
       </w:r>
     </w:p>
     <w:p>
@@ -5569,8 +6057,29 @@
         <w:spacing w:after="40"/>
       </w:pPr>
       <w:r>
-        <w:t>Gunakan prepared statement dan simpan kata sandi dalam bentuk hash</w:t>
-      </w:r>
+        <w:t xml:space="preserve">Gunakan </w:t>
+      </w:r>
+      <w:proofErr w:type="spellStart"/>
+      <w:r>
+        <w:t>prepared</w:t>
+      </w:r>
+      <w:proofErr w:type="spellEnd"/>
+      <w:r>
+        <w:t xml:space="preserve"> </w:t>
+      </w:r>
+      <w:proofErr w:type="spellStart"/>
+      <w:r>
+        <w:t>statement</w:t>
+      </w:r>
+      <w:proofErr w:type="spellEnd"/>
+      <w:r>
+        <w:t xml:space="preserve"> dan simpan kata sandi dalam bentuk </w:t>
+      </w:r>
+      <w:proofErr w:type="spellStart"/>
+      <w:r>
+        <w:t>hash</w:t>
+      </w:r>
+      <w:proofErr w:type="spellEnd"/>
     </w:p>
     <w:p>
       <w:pPr>
@@ -5582,7 +6091,15 @@
         <w:spacing w:after="40"/>
       </w:pPr>
       <w:r>
-        <w:t>Lakukan validasi input di sisi server</w:t>
+        <w:t xml:space="preserve">Lakukan validasi </w:t>
+      </w:r>
+      <w:proofErr w:type="spellStart"/>
+      <w:r>
+        <w:t>input</w:t>
+      </w:r>
+      <w:proofErr w:type="spellEnd"/>
+      <w:r>
+        <w:t xml:space="preserve"> di sisi server</w:t>
       </w:r>
     </w:p>
     <w:p>
@@ -5595,7 +6112,23 @@
         <w:spacing w:after="40"/>
       </w:pPr>
       <w:r>
-        <w:t>Lakukan debugging ketika menemukan error dan perbaiki</w:t>
+        <w:t xml:space="preserve">Lakukan </w:t>
+      </w:r>
+      <w:proofErr w:type="spellStart"/>
+      <w:r>
+        <w:t>debugging</w:t>
+      </w:r>
+      <w:proofErr w:type="spellEnd"/>
+      <w:r>
+        <w:t xml:space="preserve"> ketika menemukan </w:t>
+      </w:r>
+      <w:proofErr w:type="spellStart"/>
+      <w:r>
+        <w:t>error</w:t>
+      </w:r>
+      <w:proofErr w:type="spellEnd"/>
+      <w:r>
+        <w:t xml:space="preserve"> dan perbaiki</w:t>
       </w:r>
     </w:p>
     <w:p>
@@ -5633,8 +6166,13 @@
         </w:numPr>
         <w:spacing w:after="40"/>
       </w:pPr>
-      <w:r>
-        <w:t>Bug yang belum diperbaiki</w:t>
+      <w:proofErr w:type="spellStart"/>
+      <w:r>
+        <w:t>Bug</w:t>
+      </w:r>
+      <w:proofErr w:type="spellEnd"/>
+      <w:r>
+        <w:t xml:space="preserve"> yang belum diperbaiki</w:t>
       </w:r>
     </w:p>
     <w:p>
@@ -5660,7 +6198,15 @@
         <w:spacing w:after="40"/>
       </w:pPr>
       <w:r>
-        <w:t>Buat dokumentasi penggunaan aplikasi untuk setiap level pengguna (Admin, Petugas, dan Owner)</w:t>
+        <w:t xml:space="preserve">Buat dokumentasi penggunaan aplikasi untuk setiap level pengguna (Admin, Petugas, dan </w:t>
+      </w:r>
+      <w:proofErr w:type="spellStart"/>
+      <w:r>
+        <w:t>Owner</w:t>
+      </w:r>
+      <w:proofErr w:type="spellEnd"/>
+      <w:r>
+        <w:t>)</w:t>
       </w:r>
     </w:p>
     <w:p>
@@ -5709,9 +6255,19 @@
         </w:numPr>
         <w:spacing w:after="40"/>
       </w:pPr>
-      <w:r>
-        <w:t>Database dengan ekstensi .sql</w:t>
-      </w:r>
+      <w:proofErr w:type="spellStart"/>
+      <w:r>
+        <w:t>Database</w:t>
+      </w:r>
+      <w:proofErr w:type="spellEnd"/>
+      <w:r>
+        <w:t xml:space="preserve"> dengan ekstensi .</w:t>
+      </w:r>
+      <w:proofErr w:type="spellStart"/>
+      <w:r>
+        <w:t>sql</w:t>
+      </w:r>
+      <w:proofErr w:type="spellEnd"/>
     </w:p>
     <w:p>
       <w:pPr>
@@ -5774,9 +6330,11 @@
         </w:numPr>
         <w:spacing w:after="40"/>
       </w:pPr>
+      <w:proofErr w:type="spellStart"/>
       <w:r>
         <w:t>Debugging</w:t>
       </w:r>
+      <w:proofErr w:type="spellEnd"/>
     </w:p>
     <w:p>
       <w:pPr>
@@ -5788,7 +6346,23 @@
         <w:spacing w:after="40"/>
       </w:pPr>
       <w:r>
-        <w:t>Pengujian (black box)</w:t>
+        <w:t>Pengujian (</w:t>
+      </w:r>
+      <w:proofErr w:type="spellStart"/>
+      <w:r>
+        <w:t>black</w:t>
+      </w:r>
+      <w:proofErr w:type="spellEnd"/>
+      <w:r>
+        <w:t xml:space="preserve"> </w:t>
+      </w:r>
+      <w:proofErr w:type="spellStart"/>
+      <w:r>
+        <w:t>box</w:t>
+      </w:r>
+      <w:proofErr w:type="spellEnd"/>
+      <w:r>
+        <w:t>)</w:t>
       </w:r>
     </w:p>
     <w:p>
@@ -5886,8 +6460,19 @@
         <w:szCs w:val="16"/>
       </w:rPr>
       <w:tab/>
-      <w:t>Hak Cipta pada Kemendikdasmen</w:t>
+      <w:t xml:space="preserve">Hak Cipta pada </w:t>
     </w:r>
+    <w:proofErr w:type="spellStart"/>
+    <w:r>
+      <w:rPr>
+        <w:b/>
+        <w:bCs/>
+        <w:sz w:val="16"/>
+        <w:szCs w:val="16"/>
+      </w:rPr>
+      <w:t>Kemendikdasmen</w:t>
+    </w:r>
+    <w:proofErr w:type="spellEnd"/>
     <w:r>
       <w:rPr>
         <w:b/>

</xml_diff>